<commit_message>
Usar las notas de OTR como base teórica de la práctica de kLa
</commit_message>
<xml_diff>
--- a/practica/Anexo_instructor.docx
+++ b/practica/Anexo_instructor.docx
@@ -648,7 +648,7 @@
       </w:r>
     </w:p>
     <w:bookmarkEnd w:id="13"/>
-    <w:bookmarkStart w:id="14" w:name="fuentes-del-material"/>
+    <w:bookmarkStart w:id="15" w:name="fuentes-del-material"/>
     <w:p>
       <w:pPr>
         <w:pStyle w:val="Heading1"/>
@@ -664,10 +664,30 @@
         <w:jc w:val="both"/>
       </w:pPr>
       <w:r>
-        <w:t xml:space="preserve">El fundamento se adaptó de las notas técnicas de determinación de kLa incluidas en este proyecto. El formato corresponde a las prácticas de respuesta de sensores y control de oxígeno. La bibliografía del documento de origen se conserva allí para consulta; los resultados del taller se documentarán con sus propios registros.</w:t>
+        <w:t xml:space="preserve">La práctica se basa en las notas técnicas de determinación de kLa de OTR, con las condiciones de operación adaptadas al reactor Sartorius de 50 L y 30 L de agua. El formato corresponde a las prácticas de respuesta de sensores y control de oxígeno. La bibliografía recomendada del documento de origen se incluye en la guía de participantes. Los resultados del taller se documentarán con sus propios registros.</w:t>
+      </w:r>
+    </w:p>
+    <w:bookmarkStart w:id="14" w:name="X25fc27293bba94b5a6fae69b291caa9b0cb621d"/>
+    <w:p>
+      <w:pPr>
+        <w:pStyle w:val="Heading2"/>
+        <w:jc w:val="both"/>
+      </w:pPr>
+      <w:r>
+        <w:t xml:space="preserve">Revisión de la notación del documento original</w:t>
+      </w:r>
+    </w:p>
+    <w:p>
+      <w:pPr>
+        <w:pStyle w:val="FirstParagraph"/>
+        <w:jc w:val="both"/>
+      </w:pPr>
+      <w:r>
+        <w:t xml:space="preserve">En la integración del balance, el numerador es C* − C₀, donde C₀ es la concentración inicial. Usar C_L sin indicar que se trata del valor inicial haría ambigua la expresión. La ausencia de consumo de oxígeno es una hipótesis del balance y no equivale a esterilidad. En el método de fase gaseosa, medir la concentración de oxígeno de salida requiere además conocer o estimar el caudal para cerrar el balance.</w:t>
       </w:r>
     </w:p>
     <w:bookmarkEnd w:id="14"/>
+    <w:bookmarkEnd w:id="15"/>
     <w:sectPr>
       <w:headerReference w:type="default" r:id="rId9"/>
       <w:footerReference w:type="default" r:id="rId10"/>

</xml_diff>